<commit_message>
Payhip listing docx with tables
Co-Authored-By: Claude Sonnet 5.5 <noreply@anthropic.com>
Claude-Session: https://claude.ai/code/session_01TDEecx11fZJG7Z9gmzjxyw
</commit_message>
<xml_diff>
--- a/_paper4/dist/payhip/PAYHIP-LISTING.docx
+++ b/_paper4/dist/payhip/PAYHIP-LISTING.docx
@@ -23,6 +23,237 @@
         <w:t>1. At a glance</w:t>
       </w:r>
     </w:p>
+    <w:tbl>
+      <w:tblPr>
+        <w:tblStyle w:val="TableGrid"/>
+        <w:tblW w:type="auto" w:w="0"/>
+        <w:tblLook w:firstColumn="1" w:firstRow="1" w:lastColumn="0" w:lastRow="0" w:noHBand="0" w:noVBand="1" w:val="04A0"/>
+      </w:tblPr>
+      <w:tblGrid>
+        <w:gridCol w:w="4320"/>
+        <w:gridCol w:w="4320"/>
+      </w:tblGrid>
+      <w:tr>
+        <w:tc>
+          <w:tcPr>
+            <w:tcW w:type="dxa" w:w="4320"/>
+          </w:tcPr>
+          <w:p>
+            <w:r>
+              <w:t>Item</w:t>
+            </w:r>
+          </w:p>
+        </w:tc>
+        <w:tc>
+          <w:tcPr>
+            <w:tcW w:type="dxa" w:w="4320"/>
+          </w:tcPr>
+          <w:p>
+            <w:r>
+              <w:t>Value</w:t>
+            </w:r>
+          </w:p>
+        </w:tc>
+      </w:tr>
+      <w:tr>
+        <w:tc>
+          <w:tcPr>
+            <w:tcW w:type="dxa" w:w="4320"/>
+          </w:tcPr>
+          <w:p>
+            <w:r>
+              <w:t>Product type</w:t>
+            </w:r>
+          </w:p>
+        </w:tc>
+        <w:tc>
+          <w:tcPr>
+            <w:tcW w:type="dxa" w:w="4320"/>
+          </w:tcPr>
+          <w:p>
+            <w:r>
+              <w:t>Digital download</w:t>
+            </w:r>
+          </w:p>
+        </w:tc>
+      </w:tr>
+      <w:tr>
+        <w:tc>
+          <w:tcPr>
+            <w:tcW w:type="dxa" w:w="4320"/>
+          </w:tcPr>
+          <w:p>
+            <w:r>
+              <w:t>Title</w:t>
+            </w:r>
+          </w:p>
+        </w:tc>
+        <w:tc>
+          <w:tcPr>
+            <w:tcW w:type="dxa" w:w="4320"/>
+          </w:tcPr>
+          <w:p>
+            <w:r>
+              <w:t>The Discard</w:t>
+            </w:r>
+          </w:p>
+        </w:tc>
+      </w:tr>
+      <w:tr>
+        <w:tc>
+          <w:tcPr>
+            <w:tcW w:type="dxa" w:w="4320"/>
+          </w:tcPr>
+          <w:p>
+            <w:r>
+              <w:t>Subtitle</w:t>
+            </w:r>
+          </w:p>
+        </w:tc>
+        <w:tc>
+          <w:tcPr>
+            <w:tcW w:type="dxa" w:w="4320"/>
+          </w:tcPr>
+          <w:p>
+            <w:r>
+              <w:t>Why America Throws Away the Kidneys It Begs For, and the Inventions Waiting to Stop It</w:t>
+            </w:r>
+          </w:p>
+        </w:tc>
+      </w:tr>
+      <w:tr>
+        <w:tc>
+          <w:tcPr>
+            <w:tcW w:type="dxa" w:w="4320"/>
+          </w:tcPr>
+          <w:p>
+            <w:r>
+              <w:t>Author</w:t>
+            </w:r>
+          </w:p>
+        </w:tc>
+        <w:tc>
+          <w:tcPr>
+            <w:tcW w:type="dxa" w:w="4320"/>
+          </w:tcPr>
+          <w:p>
+            <w:r>
+              <w:t>Jeff Parke</w:t>
+            </w:r>
+          </w:p>
+        </w:tc>
+      </w:tr>
+      <w:tr>
+        <w:tc>
+          <w:tcPr>
+            <w:tcW w:type="dxa" w:w="4320"/>
+          </w:tcPr>
+          <w:p>
+            <w:r>
+              <w:t>Length / trim</w:t>
+            </w:r>
+          </w:p>
+        </w:tc>
+        <w:tc>
+          <w:tcPr>
+            <w:tcW w:type="dxa" w:w="4320"/>
+          </w:tcPr>
+          <w:p>
+            <w:r>
+              <w:t>136 pages, 6 × 9 in</w:t>
+            </w:r>
+          </w:p>
+        </w:tc>
+      </w:tr>
+      <w:tr>
+        <w:tc>
+          <w:tcPr>
+            <w:tcW w:type="dxa" w:w="4320"/>
+          </w:tcPr>
+          <w:p>
+            <w:r>
+              <w:t>Files to upload</w:t>
+            </w:r>
+          </w:p>
+        </w:tc>
+        <w:tc>
+          <w:tcPr>
+            <w:tcW w:type="dxa" w:w="4320"/>
+          </w:tcPr>
+          <w:p>
+            <w:r>
+              <w:t>The-Discard.pdf (master) and The-Discard.epub</w:t>
+            </w:r>
+          </w:p>
+        </w:tc>
+      </w:tr>
+      <w:tr>
+        <w:tc>
+          <w:tcPr>
+            <w:tcW w:type="dxa" w:w="4320"/>
+          </w:tcPr>
+          <w:p>
+            <w:r>
+              <w:t>Do not upload</w:t>
+            </w:r>
+          </w:p>
+        </w:tc>
+        <w:tc>
+          <w:tcPr>
+            <w:tcW w:type="dxa" w:w="4320"/>
+          </w:tcPr>
+          <w:p>
+            <w:r>
+              <w:t>The .docx (editable copy for you; page breaks shift in Word)</w:t>
+            </w:r>
+          </w:p>
+        </w:tc>
+      </w:tr>
+      <w:tr>
+        <w:tc>
+          <w:tcPr>
+            <w:tcW w:type="dxa" w:w="4320"/>
+          </w:tcPr>
+          <w:p>
+            <w:r>
+              <w:t>Price</w:t>
+            </w:r>
+          </w:p>
+        </w:tc>
+        <w:tc>
+          <w:tcPr>
+            <w:tcW w:type="dxa" w:w="4320"/>
+          </w:tcPr>
+          <w:p>
+            <w:r>
+              <w:t>$14.99 list. Optional launch price $9.99 for 14 days</w:t>
+            </w:r>
+          </w:p>
+        </w:tc>
+      </w:tr>
+      <w:tr>
+        <w:tc>
+          <w:tcPr>
+            <w:tcW w:type="dxa" w:w="4320"/>
+          </w:tcPr>
+          <w:p>
+            <w:r>
+              <w:t>Main image</w:t>
+            </w:r>
+          </w:p>
+        </w:tc>
+        <w:tc>
+          <w:tcPr>
+            <w:tcW w:type="dxa" w:w="4320"/>
+          </w:tcPr>
+          <w:p>
+            <w:r>
+              <w:t>payhip-01-cover-portrait.png (1950 × 2700)</w:t>
+            </w:r>
+          </w:p>
+        </w:tc>
+      </w:tr>
+    </w:tbl>
     <w:p>
       <w:pPr>
         <w:pStyle w:val="Heading1"/>
@@ -205,6 +436,455 @@
         <w:t>Payhip lets you add a main image plus extra images (and a video). Payhip does not publish an official pixel size for product images, so these are sized to be safe for any crop: the main image is portrait at 3:4 and the others are 16:9 or square. If a crop looks off in preview, use the square one as the main image.</w:t>
       </w:r>
     </w:p>
+    <w:tbl>
+      <w:tblPr>
+        <w:tblStyle w:val="TableGrid"/>
+        <w:tblW w:type="auto" w:w="0"/>
+        <w:tblLook w:firstColumn="1" w:firstRow="1" w:lastColumn="0" w:lastRow="0" w:noHBand="0" w:noVBand="1" w:val="04A0"/>
+      </w:tblPr>
+      <w:tblGrid>
+        <w:gridCol w:w="1440"/>
+        <w:gridCol w:w="1440"/>
+        <w:gridCol w:w="1440"/>
+        <w:gridCol w:w="1440"/>
+        <w:gridCol w:w="1440"/>
+        <w:gridCol w:w="1440"/>
+      </w:tblGrid>
+      <w:tr>
+        <w:tc>
+          <w:tcPr>
+            <w:tcW w:type="dxa" w:w="1440"/>
+          </w:tcPr>
+          <w:p>
+            <w:r>
+              <w:t>Order</w:t>
+            </w:r>
+          </w:p>
+        </w:tc>
+        <w:tc>
+          <w:tcPr>
+            <w:tcW w:type="dxa" w:w="1440"/>
+          </w:tcPr>
+          <w:p>
+            <w:r>
+              <w:t>Slot</w:t>
+            </w:r>
+          </w:p>
+        </w:tc>
+        <w:tc>
+          <w:tcPr>
+            <w:tcW w:type="dxa" w:w="1440"/>
+          </w:tcPr>
+          <w:p>
+            <w:r>
+              <w:t>File</w:t>
+            </w:r>
+          </w:p>
+        </w:tc>
+        <w:tc>
+          <w:tcPr>
+            <w:tcW w:type="dxa" w:w="1440"/>
+          </w:tcPr>
+          <w:p>
+            <w:r>
+              <w:t>Size</w:t>
+            </w:r>
+          </w:p>
+        </w:tc>
+        <w:tc>
+          <w:tcPr>
+            <w:tcW w:type="dxa" w:w="1440"/>
+          </w:tcPr>
+          <w:p>
+            <w:r>
+              <w:t>What it shows</w:t>
+            </w:r>
+          </w:p>
+        </w:tc>
+        <w:tc>
+          <w:tcPr>
+            <w:tcW w:type="dxa" w:w="1440"/>
+          </w:tcPr>
+          <w:p>
+            <w:r>
+              <w:t>Alt text</w:t>
+            </w:r>
+          </w:p>
+        </w:tc>
+      </w:tr>
+      <w:tr>
+        <w:tc>
+          <w:tcPr>
+            <w:tcW w:type="dxa" w:w="1440"/>
+          </w:tcPr>
+          <w:p>
+            <w:r>
+              <w:t>1</w:t>
+            </w:r>
+          </w:p>
+        </w:tc>
+        <w:tc>
+          <w:tcPr>
+            <w:tcW w:type="dxa" w:w="1440"/>
+          </w:tcPr>
+          <w:p>
+            <w:r>
+              <w:t>Main / cover</w:t>
+            </w:r>
+          </w:p>
+        </w:tc>
+        <w:tc>
+          <w:tcPr>
+            <w:tcW w:type="dxa" w:w="1440"/>
+          </w:tcPr>
+          <w:p>
+            <w:r>
+              <w:t>payhip-01-cover-portrait.png (or -1280.jpg if the upload is slow)</w:t>
+            </w:r>
+          </w:p>
+        </w:tc>
+        <w:tc>
+          <w:tcPr>
+            <w:tcW w:type="dxa" w:w="1440"/>
+          </w:tcPr>
+          <w:p>
+            <w:r>
+              <w:t>1950 × 2700</w:t>
+            </w:r>
+          </w:p>
+        </w:tc>
+        <w:tc>
+          <w:tcPr>
+            <w:tcW w:type="dxa" w:w="1440"/>
+          </w:tcPr>
+          <w:p>
+            <w:r>
+              <w:t>The final cover</w:t>
+            </w:r>
+          </w:p>
+        </w:tc>
+        <w:tc>
+          <w:tcPr>
+            <w:tcW w:type="dxa" w:w="1440"/>
+          </w:tcPr>
+          <w:p>
+            <w:r>
+              <w:t>The Discard by Jeff Parke, book cover</w:t>
+            </w:r>
+          </w:p>
+        </w:tc>
+      </w:tr>
+      <w:tr>
+        <w:tc>
+          <w:tcPr>
+            <w:tcW w:type="dxa" w:w="1440"/>
+          </w:tcPr>
+          <w:p>
+            <w:r>
+              <w:t>2</w:t>
+            </w:r>
+          </w:p>
+        </w:tc>
+        <w:tc>
+          <w:tcPr>
+            <w:tcW w:type="dxa" w:w="1440"/>
+          </w:tcPr>
+          <w:p>
+            <w:r>
+              <w:t>Extra image 1</w:t>
+            </w:r>
+          </w:p>
+        </w:tc>
+        <w:tc>
+          <w:tcPr>
+            <w:tcW w:type="dxa" w:w="1440"/>
+          </w:tcPr>
+          <w:p>
+            <w:r>
+              <w:t>payhip-02-product-square.png</w:t>
+            </w:r>
+          </w:p>
+        </w:tc>
+        <w:tc>
+          <w:tcPr>
+            <w:tcW w:type="dxa" w:w="1440"/>
+          </w:tcPr>
+          <w:p>
+            <w:r>
+              <w:t>1600 × 1600</w:t>
+            </w:r>
+          </w:p>
+        </w:tc>
+        <w:tc>
+          <w:tcPr>
+            <w:tcW w:type="dxa" w:w="1440"/>
+          </w:tcPr>
+          <w:p>
+            <w:r>
+              <w:t>Cover mockup with "136 pages, PDF + EPUB, instant download"</w:t>
+            </w:r>
+          </w:p>
+        </w:tc>
+        <w:tc>
+          <w:tcPr>
+            <w:tcW w:type="dxa" w:w="1440"/>
+          </w:tcPr>
+          <w:p>
+            <w:r>
+              <w:t>The Discard, 136-page PDF and EPUB, instant download</w:t>
+            </w:r>
+          </w:p>
+        </w:tc>
+      </w:tr>
+      <w:tr>
+        <w:tc>
+          <w:tcPr>
+            <w:tcW w:type="dxa" w:w="1440"/>
+          </w:tcPr>
+          <w:p>
+            <w:r>
+              <w:t>3</w:t>
+            </w:r>
+          </w:p>
+        </w:tc>
+        <w:tc>
+          <w:tcPr>
+            <w:tcW w:type="dxa" w:w="1440"/>
+          </w:tcPr>
+          <w:p>
+            <w:r>
+              <w:t>Extra image 2</w:t>
+            </w:r>
+          </w:p>
+        </w:tc>
+        <w:tc>
+          <w:tcPr>
+            <w:tcW w:type="dxa" w:w="1440"/>
+          </w:tcPr>
+          <w:p>
+            <w:r>
+              <w:t>payhip-03-numbers.png</w:t>
+            </w:r>
+          </w:p>
+        </w:tc>
+        <w:tc>
+          <w:tcPr>
+            <w:tcW w:type="dxa" w:w="1440"/>
+          </w:tcPr>
+          <w:p>
+            <w:r>
+              <w:t>1600 × 900</w:t>
+            </w:r>
+          </w:p>
+        </w:tc>
+        <w:tc>
+          <w:tcPr>
+            <w:tcW w:type="dxa" w:w="1440"/>
+          </w:tcPr>
+          <w:p>
+            <w:r>
+              <w:t>Four headline numbers from the book</w:t>
+            </w:r>
+          </w:p>
+        </w:tc>
+        <w:tc>
+          <w:tcPr>
+            <w:tcW w:type="dxa" w:w="1440"/>
+          </w:tcPr>
+          <w:p>
+            <w:r>
+              <w:t>Four numbers from The Discard: 29.3%, 16 offers, 39%, 48 days</w:t>
+            </w:r>
+          </w:p>
+        </w:tc>
+      </w:tr>
+      <w:tr>
+        <w:tc>
+          <w:tcPr>
+            <w:tcW w:type="dxa" w:w="1440"/>
+          </w:tcPr>
+          <w:p>
+            <w:r>
+              <w:t>4</w:t>
+            </w:r>
+          </w:p>
+        </w:tc>
+        <w:tc>
+          <w:tcPr>
+            <w:tcW w:type="dxa" w:w="1440"/>
+          </w:tcPr>
+          <w:p>
+            <w:r>
+              <w:t>Extra image 3</w:t>
+            </w:r>
+          </w:p>
+        </w:tc>
+        <w:tc>
+          <w:tcPr>
+            <w:tcW w:type="dxa" w:w="1440"/>
+          </w:tcPr>
+          <w:p>
+            <w:r>
+              <w:t>payhip-04-inside.png</w:t>
+            </w:r>
+          </w:p>
+        </w:tc>
+        <w:tc>
+          <w:tcPr>
+            <w:tcW w:type="dxa" w:w="1440"/>
+          </w:tcPr>
+          <w:p>
+            <w:r>
+              <w:t>1600 × 900</w:t>
+            </w:r>
+          </w:p>
+        </w:tc>
+        <w:tc>
+          <w:tcPr>
+            <w:tcW w:type="dxa" w:w="1440"/>
+          </w:tcPr>
+          <w:p>
+            <w:r>
+              <w:t>Contents page, a chapter opening, the moves page</w:t>
+            </w:r>
+          </w:p>
+        </w:tc>
+        <w:tc>
+          <w:tcPr>
+            <w:tcW w:type="dxa" w:w="1440"/>
+          </w:tcPr>
+          <w:p>
+            <w:r>
+              <w:t>Inside The Discard: contents, a chapter and a diagram</w:t>
+            </w:r>
+          </w:p>
+        </w:tc>
+      </w:tr>
+      <w:tr>
+        <w:tc>
+          <w:tcPr>
+            <w:tcW w:type="dxa" w:w="1440"/>
+          </w:tcPr>
+          <w:p>
+            <w:r>
+              <w:t>5</w:t>
+            </w:r>
+          </w:p>
+        </w:tc>
+        <w:tc>
+          <w:tcPr>
+            <w:tcW w:type="dxa" w:w="1440"/>
+          </w:tcPr>
+          <w:p>
+            <w:r>
+              <w:t>Extra image 4</w:t>
+            </w:r>
+          </w:p>
+        </w:tc>
+        <w:tc>
+          <w:tcPr>
+            <w:tcW w:type="dxa" w:w="1440"/>
+          </w:tcPr>
+          <w:p>
+            <w:r>
+              <w:t>payhip-05-structure.png</w:t>
+            </w:r>
+          </w:p>
+        </w:tc>
+        <w:tc>
+          <w:tcPr>
+            <w:tcW w:type="dxa" w:w="1440"/>
+          </w:tcPr>
+          <w:p>
+            <w:r>
+              <w:t>1600 × 900</w:t>
+            </w:r>
+          </w:p>
+        </w:tc>
+        <w:tc>
+          <w:tcPr>
+            <w:tcW w:type="dxa" w:w="1440"/>
+          </w:tcPr>
+          <w:p>
+            <w:r>
+              <w:t>The four-part map of the book</w:t>
+            </w:r>
+          </w:p>
+        </w:tc>
+        <w:tc>
+          <w:tcPr>
+            <w:tcW w:type="dxa" w:w="1440"/>
+          </w:tcPr>
+          <w:p>
+            <w:r>
+              <w:t>The four parts of The Discard</w:t>
+            </w:r>
+          </w:p>
+        </w:tc>
+      </w:tr>
+      <w:tr>
+        <w:tc>
+          <w:tcPr>
+            <w:tcW w:type="dxa" w:w="1440"/>
+          </w:tcPr>
+          <w:p>
+            <w:r>
+              <w:t>6</w:t>
+            </w:r>
+          </w:p>
+        </w:tc>
+        <w:tc>
+          <w:tcPr>
+            <w:tcW w:type="dxa" w:w="1440"/>
+          </w:tcPr>
+          <w:p>
+            <w:r>
+              <w:t>Extra image 5</w:t>
+            </w:r>
+          </w:p>
+        </w:tc>
+        <w:tc>
+          <w:tcPr>
+            <w:tcW w:type="dxa" w:w="1440"/>
+          </w:tcPr>
+          <w:p>
+            <w:r>
+              <w:t>payhip-06-fifteen-moves.png</w:t>
+            </w:r>
+          </w:p>
+        </w:tc>
+        <w:tc>
+          <w:tcPr>
+            <w:tcW w:type="dxa" w:w="1440"/>
+          </w:tcPr>
+          <w:p>
+            <w:r>
+              <w:t>1600 × 900</w:t>
+            </w:r>
+          </w:p>
+        </w:tc>
+        <w:tc>
+          <w:tcPr>
+            <w:tcW w:type="dxa" w:w="1440"/>
+          </w:tcPr>
+          <w:p>
+            <w:r>
+              <w:t>The fifteen-moves diagram</w:t>
+            </w:r>
+          </w:p>
+        </w:tc>
+        <w:tc>
+          <w:tcPr>
+            <w:tcW w:type="dxa" w:w="1440"/>
+          </w:tcPr>
+          <w:p>
+            <w:r>
+              <w:t>The fifteen moves, from The Discard</w:t>
+            </w:r>
+          </w:p>
+        </w:tc>
+      </w:tr>
+    </w:tbl>
     <w:p>
       <w:r>
         <w:t>Put the numbers image second or third: it is the strongest scroll-stopper.</w:t>
@@ -264,28 +944,43 @@
       </w:r>
     </w:p>
     <w:p>
+      <w:pPr>
+        <w:pStyle w:val="ListNumber"/>
+      </w:pPr>
       <w:r>
-        <w:t>1. Add product, then Digital Download.</w:t>
+        <w:t>Add product, then Digital Download.</w:t>
       </w:r>
     </w:p>
     <w:p>
+      <w:pPr>
+        <w:pStyle w:val="ListNumber"/>
+      </w:pPr>
       <w:r>
-        <w:t>2. Upload The-Discard.pdf and The-Discard.epub as two files in the same product, so buyers get both.</w:t>
+        <w:t>Upload The-Discard.pdf and The-Discard.epub as two files in the same product, so buyers get both.</w:t>
       </w:r>
     </w:p>
     <w:p>
+      <w:pPr>
+        <w:pStyle w:val="ListNumber"/>
+      </w:pPr>
       <w:r>
-        <w:t>3. Turn on instant delivery.</w:t>
+        <w:t>Turn on instant delivery.</w:t>
       </w:r>
     </w:p>
     <w:p>
+      <w:pPr>
+        <w:pStyle w:val="ListNumber"/>
+      </w:pPr>
       <w:r>
-        <w:t>4. Optional: enable PDF stamping (adds the buyer's email to each page) if your Payhip plan supports it. It deters sharing but modifies the file, so test the stamped copy once.</w:t>
+        <w:t>Optional: enable PDF stamping (adds the buyer's email to each page) if your Payhip plan supports it. It deters sharing but modifies the file, so test the stamped copy once.</w:t>
       </w:r>
     </w:p>
     <w:p>
+      <w:pPr>
+        <w:pStyle w:val="ListNumber"/>
+      </w:pPr>
       <w:r>
-        <w:t>5. Preview the product page on phone and desktop before publishing.</w:t>
+        <w:t>Preview the product page on phone and desktop before publishing.</w:t>
       </w:r>
     </w:p>
     <w:p>

</xml_diff>